<commit_message>
UI toimimaan, pistelaskuri ja raportin päivitys
</commit_message>
<xml_diff>
--- a/Raportti/Gamejamraporttitiimi7.docx
+++ b/Raportti/Gamejamraporttitiimi7.docx
@@ -158,7 +158,209 @@
           <w:sz w:val="36"/>
           <w:szCs w:val="36"/>
         </w:rPr>
-        <w:t xml:space="preserve"> ja hahmot peliin. Koko tiimi osallistuu tähän vaiheeseen. (Paikalla Miia, Piita ja Ville 4.5.)</w:t>
+        <w:t xml:space="preserve"> ja hahmot peliin. Koko tiimi osallistuu tähän vaiheeseen. (Paikalla Miia, Piita</w:t>
+      </w:r>
+      <w:r>
+        <w:rPr>
+          <w:sz w:val="36"/>
+          <w:szCs w:val="36"/>
+        </w:rPr>
+        <w:t>, Ilmari</w:t>
+      </w:r>
+      <w:r>
+        <w:rPr>
+          <w:sz w:val="36"/>
+          <w:szCs w:val="36"/>
+        </w:rPr>
+        <w:t xml:space="preserve"> ja Ville 4.5.)</w:t>
+      </w:r>
+      <w:r>
+        <w:rPr>
+          <w:sz w:val="36"/>
+          <w:szCs w:val="36"/>
+        </w:rPr>
+        <w:t xml:space="preserve"> </w:t>
+      </w:r>
+      <w:proofErr w:type="spellStart"/>
+      <w:r>
+        <w:rPr>
+          <w:sz w:val="36"/>
+          <w:szCs w:val="36"/>
+        </w:rPr>
+        <w:t>Art</w:t>
+      </w:r>
+      <w:proofErr w:type="spellEnd"/>
+      <w:r>
+        <w:rPr>
+          <w:sz w:val="36"/>
+          <w:szCs w:val="36"/>
+        </w:rPr>
+        <w:t xml:space="preserve"> osuuden jälkeen loimme </w:t>
+      </w:r>
+      <w:proofErr w:type="spellStart"/>
+      <w:r>
+        <w:rPr>
+          <w:sz w:val="36"/>
+          <w:szCs w:val="36"/>
+        </w:rPr>
+        <w:t>tilet</w:t>
+      </w:r>
+      <w:proofErr w:type="spellEnd"/>
+      <w:r>
+        <w:rPr>
+          <w:sz w:val="36"/>
+          <w:szCs w:val="36"/>
+        </w:rPr>
+        <w:t xml:space="preserve">, lisäsimme hahmon ja sille liikutettavuuden. Lisäsimme myös kolikot mappiin. Aloitimme UI-puolta lisäämällä pelaajan elämät sydän symboleilla peliin. Törmäsimme ongelmaan pelaajan kuollessa </w:t>
+      </w:r>
+      <w:proofErr w:type="spellStart"/>
+      <w:r>
+        <w:rPr>
+          <w:sz w:val="36"/>
+          <w:szCs w:val="36"/>
+        </w:rPr>
+        <w:t>sydämmet</w:t>
+      </w:r>
+      <w:proofErr w:type="spellEnd"/>
+      <w:r>
+        <w:rPr>
+          <w:sz w:val="36"/>
+          <w:szCs w:val="36"/>
+        </w:rPr>
+        <w:t xml:space="preserve"> eivät poistuneet pelistä. Mietimme tovin ongelmaa ja totesimme että jatketaan huomenna tuoreilla ajatuksilla. Kokonaisuudessaan teimme peliä tänään noin 9h, sisältäen tauot.</w:t>
+      </w:r>
+    </w:p>
+    <w:p>
+      <w:pPr>
+        <w:rPr>
+          <w:sz w:val="36"/>
+          <w:szCs w:val="36"/>
+        </w:rPr>
+      </w:pPr>
+    </w:p>
+    <w:p>
+      <w:pPr>
+        <w:jc w:val="center"/>
+        <w:rPr>
+          <w:sz w:val="36"/>
+          <w:szCs w:val="36"/>
+        </w:rPr>
+      </w:pPr>
+      <w:r>
+        <w:rPr>
+          <w:sz w:val="36"/>
+          <w:szCs w:val="36"/>
+        </w:rPr>
+        <w:t>5.5.</w:t>
+      </w:r>
+    </w:p>
+    <w:p>
+      <w:pPr>
+        <w:rPr>
+          <w:sz w:val="36"/>
+          <w:szCs w:val="36"/>
+        </w:rPr>
+      </w:pPr>
+      <w:r>
+        <w:rPr>
+          <w:sz w:val="36"/>
+          <w:szCs w:val="36"/>
+        </w:rPr>
+        <w:t xml:space="preserve">Sydänten poistuminen </w:t>
+      </w:r>
+      <w:proofErr w:type="spellStart"/>
+      <w:r>
+        <w:rPr>
+          <w:sz w:val="36"/>
+          <w:szCs w:val="36"/>
+        </w:rPr>
+        <w:t>UI:ssa</w:t>
+      </w:r>
+      <w:proofErr w:type="spellEnd"/>
+      <w:r>
+        <w:rPr>
+          <w:sz w:val="36"/>
+          <w:szCs w:val="36"/>
+        </w:rPr>
+        <w:t xml:space="preserve"> ratkesi tänään. </w:t>
+      </w:r>
+      <w:r>
+        <w:rPr>
+          <w:sz w:val="36"/>
+          <w:szCs w:val="36"/>
+        </w:rPr>
+        <w:t xml:space="preserve">Meillä oli </w:t>
+      </w:r>
+      <w:proofErr w:type="spellStart"/>
+      <w:r>
+        <w:rPr>
+          <w:sz w:val="36"/>
+          <w:szCs w:val="36"/>
+        </w:rPr>
+        <w:t>Texturerectit</w:t>
+      </w:r>
+      <w:proofErr w:type="spellEnd"/>
+      <w:r>
+        <w:rPr>
+          <w:sz w:val="36"/>
+          <w:szCs w:val="36"/>
+        </w:rPr>
+        <w:t xml:space="preserve"> </w:t>
+      </w:r>
+      <w:proofErr w:type="spellStart"/>
+      <w:r>
+        <w:rPr>
+          <w:sz w:val="36"/>
+          <w:szCs w:val="36"/>
+        </w:rPr>
+        <w:t>Canvaslayerin</w:t>
+      </w:r>
+      <w:proofErr w:type="spellEnd"/>
+      <w:r>
+        <w:rPr>
+          <w:sz w:val="36"/>
+          <w:szCs w:val="36"/>
+        </w:rPr>
+        <w:t xml:space="preserve"> </w:t>
+      </w:r>
+      <w:proofErr w:type="spellStart"/>
+      <w:r>
+        <w:rPr>
+          <w:sz w:val="36"/>
+          <w:szCs w:val="36"/>
+        </w:rPr>
+        <w:t>child</w:t>
+      </w:r>
+      <w:proofErr w:type="spellEnd"/>
+      <w:r>
+        <w:rPr>
+          <w:sz w:val="36"/>
+          <w:szCs w:val="36"/>
+        </w:rPr>
+        <w:t xml:space="preserve"> </w:t>
+      </w:r>
+      <w:proofErr w:type="spellStart"/>
+      <w:r>
+        <w:rPr>
+          <w:sz w:val="36"/>
+          <w:szCs w:val="36"/>
+        </w:rPr>
+        <w:t>nodena</w:t>
+      </w:r>
+      <w:proofErr w:type="spellEnd"/>
+      <w:r>
+        <w:rPr>
+          <w:sz w:val="36"/>
+          <w:szCs w:val="36"/>
+        </w:rPr>
+        <w:t xml:space="preserve"> jo</w:t>
+      </w:r>
+      <w:r>
+        <w:rPr>
+          <w:sz w:val="36"/>
+          <w:szCs w:val="36"/>
+        </w:rPr>
+        <w:t xml:space="preserve">ka aiheutti ongelman. Lisäsimme pistelaskurin myös peliin. Rakensimme mapin pelattavaan kuntoon ja korjasimme pelin niin että hahmo ei voi tippua reunoilta pois. </w:t>
       </w:r>
     </w:p>
     <w:sectPr>

</xml_diff>

<commit_message>
Raportin viimeistely ja pelin julkaisu
</commit_message>
<xml_diff>
--- a/Raportti/Gamejamraporttitiimi7.docx
+++ b/Raportti/Gamejamraporttitiimi7.docx
@@ -45,6 +45,22 @@
       <w:pPr>
         <w:jc w:val="center"/>
         <w:rPr>
+          <w:sz w:val="44"/>
+          <w:szCs w:val="44"/>
+        </w:rPr>
+      </w:pPr>
+      <w:r>
+        <w:rPr>
+          <w:sz w:val="44"/>
+          <w:szCs w:val="44"/>
+        </w:rPr>
+        <w:t>Ville, Piita, Miia &amp; Ilmari</w:t>
+      </w:r>
+    </w:p>
+    <w:p>
+      <w:pPr>
+        <w:jc w:val="center"/>
+        <w:rPr>
           <w:sz w:val="36"/>
           <w:szCs w:val="36"/>
         </w:rPr>
@@ -78,87 +94,7 @@
           <w:sz w:val="36"/>
           <w:szCs w:val="36"/>
         </w:rPr>
-        <w:t xml:space="preserve">Tiimimme tekee </w:t>
-      </w:r>
-      <w:proofErr w:type="spellStart"/>
-      <w:r>
-        <w:rPr>
-          <w:sz w:val="36"/>
-          <w:szCs w:val="36"/>
-        </w:rPr>
-        <w:t>supermario</w:t>
-      </w:r>
-      <w:proofErr w:type="spellEnd"/>
-      <w:r>
-        <w:rPr>
-          <w:sz w:val="36"/>
-          <w:szCs w:val="36"/>
-        </w:rPr>
-        <w:t xml:space="preserve"> </w:t>
-      </w:r>
-      <w:proofErr w:type="spellStart"/>
-      <w:r>
-        <w:rPr>
-          <w:sz w:val="36"/>
-          <w:szCs w:val="36"/>
-        </w:rPr>
-        <w:t>bros</w:t>
-      </w:r>
-      <w:proofErr w:type="spellEnd"/>
-      <w:r>
-        <w:rPr>
-          <w:sz w:val="36"/>
-          <w:szCs w:val="36"/>
-        </w:rPr>
-        <w:t xml:space="preserve">. tyylisen tasohyppely pelin </w:t>
-      </w:r>
-      <w:proofErr w:type="spellStart"/>
-      <w:r>
-        <w:rPr>
-          <w:sz w:val="36"/>
-          <w:szCs w:val="36"/>
-        </w:rPr>
-        <w:t>godotilla</w:t>
-      </w:r>
-      <w:proofErr w:type="spellEnd"/>
-      <w:r>
-        <w:rPr>
-          <w:sz w:val="36"/>
-          <w:szCs w:val="36"/>
-        </w:rPr>
-        <w:t xml:space="preserve">. Aloitamme projektin suunnittelemalla peliympäristön grafiikan, hahmon ja toiminnallisuuden. Ensimmäisessä vaiheessa piirrämme </w:t>
-      </w:r>
-      <w:proofErr w:type="spellStart"/>
-      <w:r>
-        <w:rPr>
-          <w:sz w:val="36"/>
-          <w:szCs w:val="36"/>
-        </w:rPr>
-        <w:t>piskelapilla</w:t>
-      </w:r>
-      <w:proofErr w:type="spellEnd"/>
-      <w:r>
-        <w:rPr>
-          <w:sz w:val="36"/>
-          <w:szCs w:val="36"/>
-        </w:rPr>
-        <w:t xml:space="preserve"> tarvittavat tasot, </w:t>
-      </w:r>
-      <w:proofErr w:type="spellStart"/>
-      <w:r>
-        <w:rPr>
-          <w:sz w:val="36"/>
-          <w:szCs w:val="36"/>
-        </w:rPr>
-        <w:t>itemit</w:t>
-      </w:r>
-      <w:proofErr w:type="spellEnd"/>
-      <w:r>
-        <w:rPr>
-          <w:sz w:val="36"/>
-          <w:szCs w:val="36"/>
-        </w:rPr>
-        <w:t xml:space="preserve"> ja hahmot peliin. Koko tiimi osallistuu tähän vaiheeseen. (Paikalla Miia, Piita</w:t>
+        <w:t>Tiimimme tekee supermario bros. tyylisen tasohyppely pelin godotilla. Aloitamme projektin suunnittelemalla peliympäristön grafiikan, hahmon ja toiminnallisuuden. Ensimmäisessä vaiheessa piirrämme piskelapilla tarvittavat tasot, itemit ja hahmot peliin. Koko tiimi osallistuu tähän vaiheeseen. (Paikalla Miia, Piita</w:t>
       </w:r>
       <w:r>
         <w:rPr>
@@ -179,55 +115,7 @@
           <w:sz w:val="36"/>
           <w:szCs w:val="36"/>
         </w:rPr>
-        <w:t xml:space="preserve"> </w:t>
-      </w:r>
-      <w:proofErr w:type="spellStart"/>
-      <w:r>
-        <w:rPr>
-          <w:sz w:val="36"/>
-          <w:szCs w:val="36"/>
-        </w:rPr>
-        <w:t>Art</w:t>
-      </w:r>
-      <w:proofErr w:type="spellEnd"/>
-      <w:r>
-        <w:rPr>
-          <w:sz w:val="36"/>
-          <w:szCs w:val="36"/>
-        </w:rPr>
-        <w:t xml:space="preserve"> osuuden jälkeen loimme </w:t>
-      </w:r>
-      <w:proofErr w:type="spellStart"/>
-      <w:r>
-        <w:rPr>
-          <w:sz w:val="36"/>
-          <w:szCs w:val="36"/>
-        </w:rPr>
-        <w:t>tilet</w:t>
-      </w:r>
-      <w:proofErr w:type="spellEnd"/>
-      <w:r>
-        <w:rPr>
-          <w:sz w:val="36"/>
-          <w:szCs w:val="36"/>
-        </w:rPr>
-        <w:t xml:space="preserve">, lisäsimme hahmon ja sille liikutettavuuden. Lisäsimme myös kolikot mappiin. Aloitimme UI-puolta lisäämällä pelaajan elämät sydän symboleilla peliin. Törmäsimme ongelmaan pelaajan kuollessa </w:t>
-      </w:r>
-      <w:proofErr w:type="spellStart"/>
-      <w:r>
-        <w:rPr>
-          <w:sz w:val="36"/>
-          <w:szCs w:val="36"/>
-        </w:rPr>
-        <w:t>sydämmet</w:t>
-      </w:r>
-      <w:proofErr w:type="spellEnd"/>
-      <w:r>
-        <w:rPr>
-          <w:sz w:val="36"/>
-          <w:szCs w:val="36"/>
-        </w:rPr>
-        <w:t xml:space="preserve"> eivät poistuneet pelistä. Mietimme tovin ongelmaa ja totesimme että jatketaan huomenna tuoreilla ajatuksilla. Kokonaisuudessaan teimme peliä tänään noin 9h, sisältäen tauot.</w:t>
+        <w:t xml:space="preserve"> Art osuuden jälkeen loimme tilet, lisäsimme hahmon ja sille liikutettavuuden. Lisäsimme myös kolikot mappiin. Aloitimme UI-puolta lisäämällä pelaajan elämät sydän symboleilla peliin. Törmäsimme ongelmaan pelaajan kuollessa sydämmet eivät poistuneet pelistä. Mietimme tovin ongelmaa ja totesimme että jatketaan huomenna tuoreilla ajatuksilla. Kokonaisuudessaan teimme peliä tänään noin 9h, sisältäen tauot.</w:t>
       </w:r>
     </w:p>
     <w:p>
@@ -266,40 +154,102 @@
           <w:sz w:val="36"/>
           <w:szCs w:val="36"/>
         </w:rPr>
-        <w:t xml:space="preserve">Sydänten poistuminen </w:t>
-      </w:r>
-      <w:proofErr w:type="spellStart"/>
-      <w:r>
-        <w:rPr>
-          <w:sz w:val="36"/>
-          <w:szCs w:val="36"/>
-        </w:rPr>
-        <w:t>UI:ssa</w:t>
-      </w:r>
-      <w:proofErr w:type="spellEnd"/>
-      <w:r>
-        <w:rPr>
-          <w:sz w:val="36"/>
-          <w:szCs w:val="36"/>
-        </w:rPr>
-        <w:t xml:space="preserve"> ratkesi tänään. </w:t>
-      </w:r>
-      <w:r>
-        <w:rPr>
-          <w:sz w:val="36"/>
-          <w:szCs w:val="36"/>
-        </w:rPr>
-        <w:t xml:space="preserve">Meillä oli </w:t>
-      </w:r>
-      <w:proofErr w:type="spellStart"/>
-      <w:r>
-        <w:rPr>
-          <w:sz w:val="36"/>
-          <w:szCs w:val="36"/>
-        </w:rPr>
-        <w:t>Texturerectit</w:t>
-      </w:r>
-      <w:proofErr w:type="spellEnd"/>
+        <w:t xml:space="preserve">Sydänten poistuminen UI:ssa ratkesi tänään. </w:t>
+      </w:r>
+      <w:r>
+        <w:rPr>
+          <w:sz w:val="36"/>
+          <w:szCs w:val="36"/>
+        </w:rPr>
+        <w:t>Meillä oli Texturerectit Canvaslayerin child nodena jo</w:t>
+      </w:r>
+      <w:r>
+        <w:rPr>
+          <w:sz w:val="36"/>
+          <w:szCs w:val="36"/>
+        </w:rPr>
+        <w:t xml:space="preserve">ka aiheutti ongelman. Lisäsimme pistelaskurin myös peliin. Rakensimme </w:t>
+      </w:r>
+      <w:r>
+        <w:rPr>
+          <w:sz w:val="36"/>
+          <w:szCs w:val="36"/>
+        </w:rPr>
+        <w:lastRenderedPageBreak/>
+        <w:t xml:space="preserve">mapin pelattavaan kuntoon ja korjasimme pelin niin että hahmo ei voi tippua reunoilta pois. </w:t>
+      </w:r>
+      <w:r>
+        <w:rPr>
+          <w:sz w:val="36"/>
+          <w:szCs w:val="36"/>
+        </w:rPr>
+        <w:t xml:space="preserve">Loimme tämän jälkeen vihollisen, joka tappaa pelaajan ja pelaaja menettää siten elämän. Loimme ääniefektit pelimaailmaan, valitsimme pixabaysta sopivat äänet eri efekteille esim. pelaaja tippuu veteen, pelaaja kerää kolikon jne. Teimme projektia aika lailla kaksi kokonaista päivää lyhyillä tauoilla. Kävimme lävitse must have elementit ja should have elementit. Julkaisimme minipelimme githubissa. Tiimiläisillämme on kiireitä loppuviikko niin sillä ahersimme pelin nyt nopeasti ”valmiiksi” kahdessa vuorokaudessa. Git hub repositorio on julkinen. Laitan raportin alle linkin repoon ja julkaisuun. Kiitos mukavasta kurssista ja aiheesta. </w:t>
+      </w:r>
+    </w:p>
+    <w:p>
+      <w:pPr>
+        <w:rPr>
+          <w:sz w:val="36"/>
+          <w:szCs w:val="36"/>
+        </w:rPr>
+      </w:pPr>
+    </w:p>
+    <w:p>
+      <w:pPr>
+        <w:jc w:val="center"/>
+        <w:rPr>
+          <w:sz w:val="36"/>
+          <w:szCs w:val="36"/>
+        </w:rPr>
+      </w:pPr>
+      <w:r>
+        <w:rPr>
+          <w:sz w:val="36"/>
+          <w:szCs w:val="36"/>
+        </w:rPr>
+        <w:t>Tekoälyn käyttö projektissa.</w:t>
+      </w:r>
+    </w:p>
+    <w:p>
+      <w:pPr>
+        <w:rPr>
+          <w:sz w:val="36"/>
+          <w:szCs w:val="36"/>
+        </w:rPr>
+      </w:pPr>
+      <w:r>
+        <w:rPr>
+          <w:sz w:val="36"/>
+          <w:szCs w:val="36"/>
+        </w:rPr>
+        <w:t xml:space="preserve">Käytimme tekoälyä debuggauksen apuna ja ongelmatilanteiden ratkomiseen. Esimerkiksi miksi peli kaatui välillä kesken kehityksen. Myös joitakin komentoja otimme claudelta siten että pelistä saadaan hyvin toimiva. </w:t>
+      </w:r>
+    </w:p>
+    <w:p>
+      <w:pPr>
+        <w:rPr>
+          <w:sz w:val="36"/>
+          <w:szCs w:val="36"/>
+        </w:rPr>
+      </w:pPr>
+    </w:p>
+    <w:p>
+      <w:pPr>
+        <w:rPr>
+          <w:sz w:val="36"/>
+          <w:szCs w:val="36"/>
+        </w:rPr>
+      </w:pPr>
+      <w:hyperlink r:id="rId4" w:history="1">
+        <w:r>
+          <w:rPr>
+            <w:rStyle w:val="Hyperlink"/>
+            <w:sz w:val="36"/>
+            <w:szCs w:val="36"/>
+          </w:rPr>
+          <w:t>https://github.com/VjjT/gamejamtiimi7/releases/tag/v1.0</w:t>
+        </w:r>
+      </w:hyperlink>
       <w:r>
         <w:rPr>
           <w:sz w:val="36"/>
@@ -307,60 +257,30 @@
         </w:rPr>
         <w:t xml:space="preserve"> </w:t>
       </w:r>
-      <w:proofErr w:type="spellStart"/>
-      <w:r>
-        <w:rPr>
-          <w:sz w:val="36"/>
-          <w:szCs w:val="36"/>
-        </w:rPr>
-        <w:t>Canvaslayerin</w:t>
-      </w:r>
-      <w:proofErr w:type="spellEnd"/>
+    </w:p>
+    <w:p>
+      <w:pPr>
+        <w:rPr>
+          <w:sz w:val="36"/>
+          <w:szCs w:val="36"/>
+        </w:rPr>
+      </w:pPr>
+      <w:hyperlink r:id="rId5" w:history="1">
+        <w:r>
+          <w:rPr>
+            <w:rStyle w:val="Hyperlink"/>
+            <w:sz w:val="36"/>
+            <w:szCs w:val="36"/>
+          </w:rPr>
+          <w:t>https://github.com/VjjT/gamejamtiimi7</w:t>
+        </w:r>
+      </w:hyperlink>
       <w:r>
         <w:rPr>
           <w:sz w:val="36"/>
           <w:szCs w:val="36"/>
         </w:rPr>
         <w:t xml:space="preserve"> </w:t>
-      </w:r>
-      <w:proofErr w:type="spellStart"/>
-      <w:r>
-        <w:rPr>
-          <w:sz w:val="36"/>
-          <w:szCs w:val="36"/>
-        </w:rPr>
-        <w:t>child</w:t>
-      </w:r>
-      <w:proofErr w:type="spellEnd"/>
-      <w:r>
-        <w:rPr>
-          <w:sz w:val="36"/>
-          <w:szCs w:val="36"/>
-        </w:rPr>
-        <w:t xml:space="preserve"> </w:t>
-      </w:r>
-      <w:proofErr w:type="spellStart"/>
-      <w:r>
-        <w:rPr>
-          <w:sz w:val="36"/>
-          <w:szCs w:val="36"/>
-        </w:rPr>
-        <w:t>nodena</w:t>
-      </w:r>
-      <w:proofErr w:type="spellEnd"/>
-      <w:r>
-        <w:rPr>
-          <w:sz w:val="36"/>
-          <w:szCs w:val="36"/>
-        </w:rPr>
-        <w:t xml:space="preserve"> jo</w:t>
-      </w:r>
-      <w:r>
-        <w:rPr>
-          <w:sz w:val="36"/>
-          <w:szCs w:val="36"/>
-        </w:rPr>
-        <w:t xml:space="preserve">ka aiheutti ongelman. Lisäsimme pistelaskurin myös peliin. Rakensimme mapin pelattavaan kuntoon ja korjasimme pelin niin että hahmo ei voi tippua reunoilta pois. </w:t>
       </w:r>
     </w:p>
     <w:sectPr>
@@ -1290,6 +1210,29 @@
       <w:spacing w:val="5"/>
     </w:rPr>
   </w:style>
+  <w:style w:type="character" w:styleId="Hyperlink">
+    <w:name w:val="Hyperlink"/>
+    <w:basedOn w:val="DefaultParagraphFont"/>
+    <w:uiPriority w:val="99"/>
+    <w:unhideWhenUsed/>
+    <w:rsid w:val="00255F84"/>
+    <w:rPr>
+      <w:color w:val="467886" w:themeColor="hyperlink"/>
+      <w:u w:val="single"/>
+    </w:rPr>
+  </w:style>
+  <w:style w:type="character" w:styleId="UnresolvedMention">
+    <w:name w:val="Unresolved Mention"/>
+    <w:basedOn w:val="DefaultParagraphFont"/>
+    <w:uiPriority w:val="99"/>
+    <w:semiHidden/>
+    <w:unhideWhenUsed/>
+    <w:rsid w:val="00255F84"/>
+    <w:rPr>
+      <w:color w:val="605E5C"/>
+      <w:shd w:val="clear" w:color="auto" w:fill="E1DFDD"/>
+    </w:rPr>
+  </w:style>
 </w:styles>
 </file>
 

</xml_diff>